<commit_message>
feat(diff): add MarkdownDiffService for line-by-line semantic LCS Markdown document comparison
</commit_message>
<xml_diff>
--- a/marksmith-v2/test_outputs/sample_tabs.docx
+++ b/marksmith-v2/test_outputs/sample_tabs.docx
@@ -361,8 +361,8 @@
       </w:r>
     </w:p>
     <w:sectPr>
-      <w:headerReference xmlns:r="http://schemas.openxmlformats.org/officeDocument/2006/relationships" w:type="default" r:id="R8bc5eb0a3ba247ae"/>
-      <w:footerReference xmlns:r="http://schemas.openxmlformats.org/officeDocument/2006/relationships" w:type="default" r:id="R9ad83ce01317490a"/>
+      <w:headerReference xmlns:r="http://schemas.openxmlformats.org/officeDocument/2006/relationships" w:type="default" r:id="R52f751b8bb6b453f"/>
+      <w:footerReference xmlns:r="http://schemas.openxmlformats.org/officeDocument/2006/relationships" w:type="default" r:id="Rb9ce38542a4d4bdf"/>
       <w:pgSz w:w="11906" w:h="16838"/>
       <w:pgMar w:top="1440" w:right="1440" w:bottom="1440" w:left="1440" w:header="576" w:footer="576" w:gutter="0"/>
     </w:sectPr>

</xml_diff>

<commit_message>
⚖️ Parity: Sync tab header styling (ISS-015) between HTML and DOCX\n\nEliminated hardcoded hex colors for native DOCX tabs, pulling dynamic styling from the selected theme instead (`ctx.Theme.Background`, `ctx.SecondaryHex`, `ctx.HeadingHex`). Modified active tab borders (heavy top border, background-matched bottom border) to simulate the overlapping active-tab CSS in the HTML Preview. Updated unit tests.
</commit_message>
<xml_diff>
--- a/marksmith-v2/test_outputs/sample_tabs.docx
+++ b/marksmith-v2/test_outputs/sample_tabs.docx
@@ -51,12 +51,12 @@
           <w:tcPr>
             <w:tcW w:w="3000" w:type="dxa"/>
             <w:tcBorders>
-              <w:top w:val="none"/>
-              <w:left w:val="none"/>
-              <w:bottom w:val="single" w:color="000000" w:sz="12" w:space="0"/>
-              <w:right w:val="none"/>
+              <w:top w:val="single" w:color="000000" w:sz="18" w:space="0"/>
+              <w:left w:val="single" w:color="D1D5DA" w:sz="6" w:space="0"/>
+              <w:bottom w:val="single" w:color="ffffff" w:sz="6" w:space="0"/>
+              <w:right w:val="single" w:color="D1D5DA" w:sz="6" w:space="0"/>
             </w:tcBorders>
-            <w:shd w:val="clear" w:color="auto" w:fill="EBF3FE"/>
+            <w:shd w:val="clear" w:color="auto" w:fill="ffffff"/>
           </w:tcPr>
           <w:p>
             <w:pPr>
@@ -86,12 +86,12 @@
           <w:tcPr>
             <w:tcW w:w="3000" w:type="dxa"/>
             <w:tcBorders>
-              <w:top w:val="none"/>
-              <w:left w:val="none"/>
+              <w:top w:val="none" w:color="auto" w:sz="0" w:space="0"/>
+              <w:left w:val="none" w:color="auto" w:sz="0" w:space="0"/>
               <w:bottom w:val="none" w:color="auto" w:sz="0" w:space="0"/>
-              <w:right w:val="none"/>
+              <w:right w:val="none" w:color="auto" w:sz="0" w:space="0"/>
             </w:tcBorders>
-            <w:shd w:val="clear" w:color="auto" w:fill="F8F9FA"/>
+            <w:shd w:val="clear" w:color="auto" w:fill="F6F8FA"/>
           </w:tcPr>
           <w:p>
             <w:pPr>
@@ -101,7 +101,7 @@
             <w:hyperlink w:history="true" w:anchor="tab_182a10694e40_1">
               <w:r>
                 <w:rPr>
-                  <w:color w:val="64748B"/>
+                  <w:color w:val="1b1f23"/>
                   <mc:AlternateContent>
                     <mc:Choice Requires="w14">
                       <w14:ligatures w14:val="standardContextual"/>
@@ -120,12 +120,12 @@
           <w:tcPr>
             <w:tcW w:w="3000" w:type="dxa"/>
             <w:tcBorders>
-              <w:top w:val="none"/>
-              <w:left w:val="none"/>
+              <w:top w:val="none" w:color="auto" w:sz="0" w:space="0"/>
+              <w:left w:val="none" w:color="auto" w:sz="0" w:space="0"/>
               <w:bottom w:val="none" w:color="auto" w:sz="0" w:space="0"/>
-              <w:right w:val="none"/>
+              <w:right w:val="none" w:color="auto" w:sz="0" w:space="0"/>
             </w:tcBorders>
-            <w:shd w:val="clear" w:color="auto" w:fill="F8F9FA"/>
+            <w:shd w:val="clear" w:color="auto" w:fill="F6F8FA"/>
           </w:tcPr>
           <w:p>
             <w:pPr>
@@ -135,7 +135,7 @@
             <w:hyperlink w:history="true" w:anchor="tab_182a10694e40_2">
               <w:r>
                 <w:rPr>
-                  <w:color w:val="64748B"/>
+                  <w:color w:val="1b1f23"/>
                   <mc:AlternateContent>
                     <mc:Choice Requires="w14">
                       <w14:ligatures w14:val="standardContextual"/>
@@ -361,8 +361,8 @@
       </w:r>
     </w:p>
     <w:sectPr>
-      <w:headerReference xmlns:r="http://schemas.openxmlformats.org/officeDocument/2006/relationships" w:type="default" r:id="Rb4c26e1114574370"/>
-      <w:footerReference xmlns:r="http://schemas.openxmlformats.org/officeDocument/2006/relationships" w:type="default" r:id="Rdf16e40b45864c48"/>
+      <w:headerReference xmlns:r="http://schemas.openxmlformats.org/officeDocument/2006/relationships" w:type="default" r:id="R2471a6738ada4b4e"/>
+      <w:footerReference xmlns:r="http://schemas.openxmlformats.org/officeDocument/2006/relationships" w:type="default" r:id="Rf18234bfc94045ba"/>
       <w:pgSz w:w="11906" w:h="16838"/>
       <w:pgMar w:top="1440" w:right="1440" w:bottom="1440" w:left="1440" w:header="576" w:footer="576" w:gutter="0"/>
     </w:sectPr>

</xml_diff>